<commit_message>
Completar plantilla de contrato con {} y mapear todos los datos
Normaliza Plantillas/2.docx con campos limpios (incluye TIPOGENERADORCLIENTE),
arma domicilio/localidad/tipo generador desde el establecimiento y asegura
includes + JS/UI alineados para que la generación Word rellene bien.

Co-authored-by: luciano123456 <luciano123456@users.noreply.github.com>
</commit_message>
<xml_diff>
--- a/SistemaOroAmbiental.Application/Contratos/Plantillas/2.docx
+++ b/SistemaOroAmbiental.Application/Contratos/Plantillas/2.docx
@@ -95,28 +95,17 @@
                       <w:szCs w:val="24"/>
                       <w:lang w:val="es-ES"/>
                     </w:rPr>
-                    <w:t>{</w:t>
-                  </w:r>
-                  <w:proofErr w:type="gramEnd"/>
-                  <w:r>
-                    <w:rPr>
-                      <w:rFonts w:cs="Calibri"/>
-                      <w:b/>
-                      <w:sz w:val="24"/>
-                      <w:szCs w:val="24"/>
-                      <w:lang w:val="es-ES"/>
-                    </w:rPr>
-                    <w:t>NOMBRECLIENTE</w:t>
-                  </w:r>
-                  <w:r>
-                    <w:rPr>
-                      <w:rFonts w:cs="Calibri"/>
-                      <w:b/>
-                      <w:sz w:val="24"/>
-                      <w:szCs w:val="24"/>
-                      <w:lang w:val="es-ES"/>
-                    </w:rPr>
-                    <w:t>}</w:t>
+                    <w:t>
+                      <w:r>
+                        <w:rPr>
+                          <w:rFonts w:cs="Calibri"/>
+                          <w:b/>
+                          <w:sz w:val="24"/>
+                          <w:szCs w:val="24"/>
+                        </w:rPr>
+                        <w:t>{NOMBRECLIENTE}</w:t>
+                      </w:r>
+                    </w:t>
                   </w:r>
                 </w:p>
                 <w:p>
@@ -166,25 +155,17 @@
                       <w:szCs w:val="24"/>
                       <w:lang w:val="es-ES"/>
                     </w:rPr>
-                    <w:t>{</w:t>
-                  </w:r>
-                  <w:r>
-                    <w:rPr>
-                      <w:rFonts w:cs="Calibri"/>
-                      <w:b/>
-                      <w:sz w:val="24"/>
-                      <w:szCs w:val="24"/>
-                    </w:rPr>
-                    <w:t>DOMICILIOCLIENTE</w:t>
-                  </w:r>
-                  <w:r>
-                    <w:rPr>
-                      <w:rFonts w:cs="Calibri"/>
-                      <w:b/>
-                      <w:sz w:val="24"/>
-                      <w:szCs w:val="24"/>
-                    </w:rPr>
-                    <w:t>}</w:t>
+                    <w:t>
+                      <w:r>
+                        <w:rPr>
+                          <w:rFonts w:cs="Calibri"/>
+                          <w:b/>
+                          <w:sz w:val="24"/>
+                          <w:szCs w:val="24"/>
+                        </w:rPr>
+                        <w:t>{DOMICILIOCLIENTE}</w:t>
+                      </w:r>
+                    </w:t>
                   </w:r>
                   <w:r>
                     <w:rPr>
@@ -231,27 +212,17 @@
                       <w:sz w:val="24"/>
                       <w:szCs w:val="24"/>
                     </w:rPr>
-                    <w:t>{</w:t>
-                  </w:r>
-                  <w:proofErr w:type="gramEnd"/>
-                  <w:r>
-                    <w:rPr>
-                      <w:rFonts w:cs="Calibri"/>
-                      <w:b/>
-                      <w:sz w:val="24"/>
-                      <w:szCs w:val="24"/>
-                    </w:rPr>
-                    <w:t>LOCALIDADCLIENTE</w:t>
-                  </w:r>
-                  <w:r>
-                    <w:rPr>
-                      <w:rFonts w:cs="Calibri"/>
-                      <w:b/>
-                      <w:sz w:val="24"/>
-                      <w:szCs w:val="24"/>
-                      <w:lang w:val="es-ES"/>
-                    </w:rPr>
-                    <w:t>}</w:t>
+                    <w:t>
+                      <w:r>
+                        <w:rPr>
+                          <w:rFonts w:cs="Calibri"/>
+                          <w:b/>
+                          <w:sz w:val="24"/>
+                          <w:szCs w:val="24"/>
+                        </w:rPr>
+                        <w:t>{LOCALIDADCLIENTE}</w:t>
+                      </w:r>
+                    </w:t>
                   </w:r>
                 </w:p>
                 <w:p>
@@ -305,25 +276,17 @@
                       <w:szCs w:val="24"/>
                       <w:lang w:val="es-ES"/>
                     </w:rPr>
-                    <w:t>{</w:t>
-                  </w:r>
-                  <w:r>
-                    <w:rPr>
-                      <w:rFonts w:cs="Calibri"/>
-                      <w:b/>
-                      <w:sz w:val="24"/>
-                      <w:szCs w:val="24"/>
-                    </w:rPr>
-                    <w:t>TELEFONOCLIENTE</w:t>
-                  </w:r>
-                  <w:r>
-                    <w:rPr>
-                      <w:rFonts w:cs="Calibri"/>
-                      <w:b/>
-                      <w:sz w:val="24"/>
-                      <w:szCs w:val="24"/>
-                    </w:rPr>
-                    <w:t>}</w:t>
+                    <w:t>
+                      <w:r>
+                        <w:rPr>
+                          <w:rFonts w:cs="Calibri"/>
+                          <w:b/>
+                          <w:sz w:val="24"/>
+                          <w:szCs w:val="24"/>
+                        </w:rPr>
+                        <w:t>{TELEFONOCLIENTE}</w:t>
+                      </w:r>
+                    </w:t>
                   </w:r>
                   <w:r>
                     <w:rPr>
@@ -374,27 +337,17 @@
                       <w:sz w:val="24"/>
                       <w:szCs w:val="24"/>
                     </w:rPr>
-                    <w:t>{</w:t>
-                  </w:r>
-                  <w:proofErr w:type="gramEnd"/>
-                  <w:r>
-                    <w:rPr>
-                      <w:rFonts w:cs="Calibri"/>
-                      <w:b/>
-                      <w:sz w:val="24"/>
-                      <w:szCs w:val="24"/>
-                    </w:rPr>
-                    <w:t>CUITCLIENTE</w:t>
-                  </w:r>
-                  <w:r>
-                    <w:rPr>
-                      <w:rFonts w:cs="Calibri"/>
-                      <w:b/>
-                      <w:sz w:val="24"/>
-                      <w:szCs w:val="24"/>
-                      <w:lang w:val="es-ES"/>
-                    </w:rPr>
-                    <w:t>}</w:t>
+                    <w:t>
+                      <w:r>
+                        <w:rPr>
+                          <w:rFonts w:cs="Calibri"/>
+                          <w:b/>
+                          <w:sz w:val="24"/>
+                          <w:szCs w:val="24"/>
+                        </w:rPr>
+                        <w:t>{CUITCLIENTE}</w:t>
+                      </w:r>
+                    </w:t>
                   </w:r>
                 </w:p>
                 <w:p>
@@ -448,35 +401,17 @@
                       <w:szCs w:val="24"/>
                       <w:lang w:val="es-ES"/>
                     </w:rPr>
-                    <w:t>{</w:t>
-                  </w:r>
-                  <w:r>
-                    <w:rPr>
-                      <w:rFonts w:cs="Calibri"/>
-                      <w:b/>
-                      <w:sz w:val="24"/>
-                      <w:szCs w:val="24"/>
-                    </w:rPr>
-                    <w:t>PROFESION</w:t>
-                  </w:r>
-                  <w:r>
-                    <w:rPr>
-                      <w:rFonts w:cs="Calibri"/>
-                      <w:b/>
-                      <w:sz w:val="24"/>
-                      <w:szCs w:val="24"/>
-                    </w:rPr>
-                    <w:t>CLIENTE</w:t>
-                  </w:r>
-                  <w:r>
-                    <w:rPr>
-                      <w:rFonts w:cs="Calibri"/>
-                      <w:b/>
-                      <w:sz w:val="24"/>
-                      <w:szCs w:val="24"/>
-                      <w:lang w:val="es-ES"/>
-                    </w:rPr>
-                    <w:t>}</w:t>
+                    <w:t>
+                      <w:r>
+                        <w:rPr>
+                          <w:rFonts w:cs="Calibri"/>
+                          <w:b/>
+                          <w:sz w:val="24"/>
+                          <w:szCs w:val="24"/>
+                        </w:rPr>
+                        <w:t>{TIPOGENERADORCLIENTE}</w:t>
+                      </w:r>
+                    </w:t>
                   </w:r>
                   <w:r>
                     <w:rPr>
@@ -515,26 +450,17 @@
                       <w:sz w:val="24"/>
                       <w:szCs w:val="24"/>
                     </w:rPr>
-                    <w:t>{</w:t>
-                  </w:r>
-                  <w:r>
-                    <w:rPr>
-                      <w:rFonts w:cs="Calibri"/>
-                      <w:b/>
-                      <w:sz w:val="24"/>
-                      <w:szCs w:val="24"/>
-                    </w:rPr>
-                    <w:t>IVACLIENTE</w:t>
-                  </w:r>
-                  <w:r>
-                    <w:rPr>
-                      <w:rFonts w:cs="Calibri"/>
-                      <w:b/>
-                      <w:sz w:val="24"/>
-                      <w:szCs w:val="24"/>
-                      <w:lang w:val="es-ES"/>
-                    </w:rPr>
-                    <w:t>}</w:t>
+                    <w:t>
+                      <w:r>
+                        <w:rPr>
+                          <w:rFonts w:cs="Calibri"/>
+                          <w:b/>
+                          <w:sz w:val="24"/>
+                          <w:szCs w:val="24"/>
+                        </w:rPr>
+                        <w:t>{IVACLIENTE}</w:t>
+                      </w:r>
+                    </w:t>
                   </w:r>
                 </w:p>
                 <w:p>
@@ -587,26 +513,17 @@
                       <w:szCs w:val="24"/>
                       <w:lang w:val="es-ES"/>
                     </w:rPr>
-                    <w:t>{</w:t>
-                  </w:r>
-                  <w:r>
-                    <w:rPr>
-                      <w:rFonts w:cs="Calibri"/>
-                      <w:b/>
-                      <w:sz w:val="24"/>
-                      <w:szCs w:val="24"/>
-                    </w:rPr>
-                    <w:t>DIASCLIENTE</w:t>
-                  </w:r>
-                  <w:r>
-                    <w:rPr>
-                      <w:rFonts w:cs="Calibri"/>
-                      <w:b/>
-                      <w:sz w:val="24"/>
-                      <w:szCs w:val="24"/>
-                      <w:lang w:val="es-ES"/>
-                    </w:rPr>
-                    <w:t>}</w:t>
+                    <w:t>
+                      <w:r>
+                        <w:rPr>
+                          <w:rFonts w:cs="Calibri"/>
+                          <w:b/>
+                          <w:sz w:val="24"/>
+                          <w:szCs w:val="24"/>
+                        </w:rPr>
+                        <w:t>{DIASCLIENTE}</w:t>
+                      </w:r>
+                    </w:t>
                   </w:r>
                   <w:r>
                     <w:rPr>
@@ -656,26 +573,17 @@
                       <w:sz w:val="24"/>
                       <w:szCs w:val="24"/>
                     </w:rPr>
-                    <w:t>{</w:t>
-                  </w:r>
-                  <w:r>
-                    <w:rPr>
-                      <w:rFonts w:cs="Calibri"/>
-                      <w:b/>
-                      <w:sz w:val="24"/>
-                      <w:szCs w:val="24"/>
-                    </w:rPr>
-                    <w:t>EMAILCLIENTE</w:t>
-                  </w:r>
-                  <w:r>
-                    <w:rPr>
-                      <w:rFonts w:cs="Calibri"/>
-                      <w:b/>
-                      <w:sz w:val="24"/>
-                      <w:szCs w:val="24"/>
-                      <w:lang w:val="es-ES"/>
-                    </w:rPr>
-                    <w:t>}</w:t>
+                    <w:t>
+                      <w:r>
+                        <w:rPr>
+                          <w:rFonts w:cs="Calibri"/>
+                          <w:b/>
+                          <w:sz w:val="24"/>
+                          <w:szCs w:val="24"/>
+                        </w:rPr>
+                        <w:t>{EMAILCLIENTE}</w:t>
+                      </w:r>
+                    </w:t>
                   </w:r>
                 </w:p>
                 <w:p>
@@ -2725,22 +2633,15 @@
           <w:sz w:val="20"/>
           <w:szCs w:val="20"/>
         </w:rPr>
-        <w:t>{</w:t>
-      </w:r>
-      <w:proofErr w:type="gramEnd"/>
-      <w:r>
-        <w:rPr>
-          <w:sz w:val="20"/>
-          <w:szCs w:val="20"/>
-        </w:rPr>
-        <w:t>DIA</w:t>
-      </w:r>
-      <w:r>
-        <w:rPr>
-          <w:sz w:val="20"/>
-          <w:szCs w:val="20"/>
-        </w:rPr>
-        <w:t>}</w:t>
+        <w:t>
+          <w:r>
+            <w:rPr>
+              <w:sz w:val="20"/>
+              <w:szCs w:val="20"/>
+            </w:rPr>
+            <w:t>{DIA}</w:t>
+          </w:r>
+        </w:t>
       </w:r>
       <w:r>
         <w:rPr>
@@ -2768,21 +2669,15 @@
           <w:sz w:val="20"/>
           <w:szCs w:val="20"/>
         </w:rPr>
-        <w:t>{</w:t>
-      </w:r>
-      <w:r>
-        <w:rPr>
-          <w:sz w:val="20"/>
-          <w:szCs w:val="20"/>
-        </w:rPr>
-        <w:t>MES</w:t>
-      </w:r>
-      <w:r>
-        <w:rPr>
-          <w:sz w:val="20"/>
-          <w:szCs w:val="20"/>
-        </w:rPr>
-        <w:t>}</w:t>
+        <w:t>
+          <w:r>
+            <w:rPr>
+              <w:sz w:val="20"/>
+              <w:szCs w:val="20"/>
+            </w:rPr>
+            <w:t>{MES}</w:t>
+          </w:r>
+        </w:t>
       </w:r>
       <w:r>
         <w:rPr>
@@ -2810,21 +2705,15 @@
           <w:sz w:val="20"/>
           <w:szCs w:val="20"/>
         </w:rPr>
-        <w:t>{</w:t>
-      </w:r>
-      <w:r>
-        <w:rPr>
-          <w:sz w:val="20"/>
-          <w:szCs w:val="20"/>
-        </w:rPr>
-        <w:t>ANIO</w:t>
-      </w:r>
-      <w:r>
-        <w:rPr>
-          <w:sz w:val="20"/>
-          <w:szCs w:val="20"/>
-        </w:rPr>
-        <w:t>}</w:t>
+        <w:t>
+          <w:r>
+            <w:rPr>
+              <w:sz w:val="20"/>
+              <w:szCs w:val="20"/>
+            </w:rPr>
+            <w:t>{ANIO}</w:t>
+          </w:r>
+        </w:t>
       </w:r>
     </w:p>
     <w:p>

</xml_diff>